<commit_message>
fixed layouts, added childrens' page
</commit_message>
<xml_diff>
--- a/Project Context.docx
+++ b/Project Context.docx
@@ -1554,10 +1554,7 @@
       </w:pPr>
       <w:r>
         <w:lastRenderedPageBreak/>
-        <w:t xml:space="preserve">10. </w:t>
-      </w:r>
-      <w:r>
-        <w:t>Known Issues / Technical Debt</w:t>
+        <w:t>10. Known Issues / Technical Debt</w:t>
       </w:r>
     </w:p>
     <w:p>
@@ -1625,6 +1622,64 @@
       </w:r>
       <w:bookmarkEnd w:id="0"/>
       <w:bookmarkEnd w:id="18"/>
+    </w:p>
+    <w:p>
+      <w:pPr>
+        <w:pStyle w:val="BodyText"/>
+      </w:pPr>
+    </w:p>
+    <w:p>
+      <w:pPr>
+        <w:pStyle w:val="BodyText"/>
+      </w:pPr>
+      <w:r>
+        <w:t>## Design Decisions</w:t>
+      </w:r>
+    </w:p>
+    <w:p>
+      <w:pPr>
+        <w:pStyle w:val="BodyText"/>
+      </w:pPr>
+    </w:p>
+    <w:p>
+      <w:pPr>
+        <w:pStyle w:val="BodyText"/>
+      </w:pPr>
+      <w:r>
+        <w:t>### Single Role Per Account</w:t>
+      </w:r>
+    </w:p>
+    <w:p>
+      <w:pPr>
+        <w:pStyle w:val="BodyText"/>
+      </w:pPr>
+      <w:r>
+        <w:t>- Each user account has ONE role (parent OR tutor)</w:t>
+      </w:r>
+    </w:p>
+    <w:p>
+      <w:pPr>
+        <w:pStyle w:val="BodyText"/>
+      </w:pPr>
+      <w:r>
+        <w:t>- Users needing both roles must create separate accounts</w:t>
+      </w:r>
+    </w:p>
+    <w:p>
+      <w:pPr>
+        <w:pStyle w:val="BodyText"/>
+      </w:pPr>
+      <w:r>
+        <w:t>- Rationale: Simplifies MVP, faster to ship</w:t>
+      </w:r>
+    </w:p>
+    <w:p>
+      <w:pPr>
+        <w:pStyle w:val="BodyText"/>
+      </w:pPr>
+      <w:r>
+        <w:t>- Future Enhancement: Multi-role support with dashboard picker</w:t>
+      </w:r>
     </w:p>
     <w:sectPr>
       <w:footnotePr>

</xml_diff>

<commit_message>
complete tutor home page + applications
</commit_message>
<xml_diff>
--- a/Project Context.docx
+++ b/Project Context.docx
@@ -1680,6 +1680,196 @@
       <w:r>
         <w:t>- Future Enhancement: Multi-role support with dashboard picker</w:t>
       </w:r>
+    </w:p>
+    <w:p>
+      <w:pPr>
+        <w:pStyle w:val="BodyText"/>
+      </w:pPr>
+    </w:p>
+    <w:p>
+      <w:pPr>
+        <w:pStyle w:val="BodyText"/>
+        <w:rPr>
+          <w:b/>
+          <w:bCs/>
+          <w:lang w:val="en-IN"/>
+        </w:rPr>
+      </w:pPr>
+      <w:r>
+        <w:rPr>
+          <w:b/>
+          <w:bCs/>
+          <w:lang w:val="en-IN"/>
+        </w:rPr>
+        <w:t>Week 1: Core Features</w:t>
+      </w:r>
+    </w:p>
+    <w:p>
+      <w:pPr>
+        <w:pStyle w:val="BodyText"/>
+        <w:rPr>
+          <w:lang w:val="en-IN"/>
+        </w:rPr>
+      </w:pPr>
+      <w:r>
+        <w:rPr>
+          <w:b/>
+          <w:bCs/>
+          <w:lang w:val="en-IN"/>
+        </w:rPr>
+        <w:t>Day 1-2:</w:t>
+      </w:r>
+      <w:r>
+        <w:rPr>
+          <w:lang w:val="en-IN"/>
+        </w:rPr>
+        <w:t xml:space="preserve"> Parent - Create child profile</w:t>
+      </w:r>
+      <w:r>
+        <w:rPr>
+          <w:lang w:val="en-IN"/>
+        </w:rPr>
+        <w:br/>
+      </w:r>
+      <w:r>
+        <w:rPr>
+          <w:b/>
+          <w:bCs/>
+          <w:lang w:val="en-IN"/>
+        </w:rPr>
+        <w:t>Day 3-4:</w:t>
+      </w:r>
+      <w:r>
+        <w:rPr>
+          <w:lang w:val="en-IN"/>
+        </w:rPr>
+        <w:t xml:space="preserve"> Parent - Post job</w:t>
+      </w:r>
+      <w:r>
+        <w:rPr>
+          <w:lang w:val="en-IN"/>
+        </w:rPr>
+        <w:br/>
+      </w:r>
+      <w:r>
+        <w:rPr>
+          <w:b/>
+          <w:bCs/>
+          <w:lang w:val="en-IN"/>
+        </w:rPr>
+        <w:t>Day 5-7:</w:t>
+      </w:r>
+      <w:r>
+        <w:rPr>
+          <w:lang w:val="en-IN"/>
+        </w:rPr>
+        <w:t xml:space="preserve"> Tutor - Qualification test</w:t>
+      </w:r>
+    </w:p>
+    <w:p>
+      <w:pPr>
+        <w:pStyle w:val="BodyText"/>
+        <w:rPr>
+          <w:b/>
+          <w:bCs/>
+          <w:lang w:val="en-IN"/>
+        </w:rPr>
+      </w:pPr>
+      <w:r>
+        <w:rPr>
+          <w:b/>
+          <w:bCs/>
+          <w:lang w:val="en-IN"/>
+        </w:rPr>
+        <w:t>Week 2: Application Flow</w:t>
+      </w:r>
+    </w:p>
+    <w:p>
+      <w:pPr>
+        <w:pStyle w:val="BodyText"/>
+        <w:rPr>
+          <w:lang w:val="en-IN"/>
+        </w:rPr>
+      </w:pPr>
+      <w:r>
+        <w:rPr>
+          <w:b/>
+          <w:bCs/>
+          <w:lang w:val="en-IN"/>
+        </w:rPr>
+        <w:t>Day 1-2:</w:t>
+      </w:r>
+      <w:r>
+        <w:rPr>
+          <w:lang w:val="en-IN"/>
+        </w:rPr>
+        <w:t xml:space="preserve"> Tutor - Browse jobs</w:t>
+      </w:r>
+      <w:r>
+        <w:rPr>
+          <w:lang w:val="en-IN"/>
+        </w:rPr>
+        <w:br/>
+      </w:r>
+      <w:r>
+        <w:rPr>
+          <w:b/>
+          <w:bCs/>
+          <w:lang w:val="en-IN"/>
+        </w:rPr>
+        <w:t>Day 3-4:</w:t>
+      </w:r>
+      <w:r>
+        <w:rPr>
+          <w:lang w:val="en-IN"/>
+        </w:rPr>
+        <w:t xml:space="preserve"> Tutor - Apply to job</w:t>
+      </w:r>
+      <w:r>
+        <w:rPr>
+          <w:lang w:val="en-IN"/>
+        </w:rPr>
+        <w:br/>
+      </w:r>
+      <w:r>
+        <w:rPr>
+          <w:b/>
+          <w:bCs/>
+          <w:lang w:val="en-IN"/>
+        </w:rPr>
+        <w:t>Day 5-6:</w:t>
+      </w:r>
+      <w:r>
+        <w:rPr>
+          <w:lang w:val="en-IN"/>
+        </w:rPr>
+        <w:t xml:space="preserve"> Parent - View &amp; accept applications</w:t>
+      </w:r>
+      <w:r>
+        <w:rPr>
+          <w:lang w:val="en-IN"/>
+        </w:rPr>
+        <w:br/>
+      </w:r>
+      <w:r>
+        <w:rPr>
+          <w:b/>
+          <w:bCs/>
+          <w:lang w:val="en-IN"/>
+        </w:rPr>
+        <w:t>Day 7:</w:t>
+      </w:r>
+      <w:r>
+        <w:rPr>
+          <w:lang w:val="en-IN"/>
+        </w:rPr>
+        <w:t xml:space="preserve"> Both - View "My Classes"</w:t>
+      </w:r>
+    </w:p>
+    <w:p>
+      <w:pPr>
+        <w:pStyle w:val="BodyText"/>
+      </w:pPr>
     </w:p>
     <w:sectPr>
       <w:footnotePr>
@@ -2576,7 +2766,6 @@
   <w:style w:type="character" w:default="1" w:styleId="DefaultParagraphFont">
     <w:name w:val="Default Paragraph Font"/>
     <w:uiPriority w:val="1"/>
-    <w:semiHidden/>
     <w:unhideWhenUsed/>
   </w:style>
   <w:style w:type="table" w:default="1" w:styleId="TableNormal">

</xml_diff>